<commit_message>
fix: use exact extracted Vet INC logo in dashboard cover
</commit_message>
<xml_diff>
--- a/context/vet-inc-dashboard-cover-editable.docx
+++ b/context/vet-inc-dashboard-cover-editable.docx
@@ -16,30 +16,13 @@
         </w:rPr>
         <w:t xml:space="preserve"/>
       </w:r>
-    </w:p>
-    <w:p>
-      <w:pPr>
-        <w:jc w:val="center"/>
-      </w:pPr>
-      <w:r>
-        <w:rPr>
-          <w:rFonts w:ascii="Arial" w:hAnsi="Arial" w:cs="Arial"/>
-          <w:sz w:val="26"/>
-          <w:sz-cs w:val="26"/>
-          <w:b/>
-          <w:spacing w:val="0"/>
-          <w:color w:val="243C6C"/>
-        </w:rPr>
-        <w:t xml:space="preserve">VET INC.</w:t>
-      </w:r>
-      <w:r>
-        <w:rPr>
-          <w:rFonts w:ascii="Arial" w:hAnsi="Arial" w:cs="Arial"/>
-          <w:sz w:val="26"/>
-          <w:sz-cs w:val="26"/>
-          <w:b/>
-          <w:spacing w:val="0"/>
-          <w:color w:val="243C6C"/>
+      <w:r>
+        <w:rPr>
+          <w:rFonts w:ascii="Arial" w:hAnsi="Arial" w:cs="Arial"/>
+          <w:sz w:val="24"/>
+          <w:sz-cs w:val="24"/>
+          <w:spacing w:val="0"/>
+          <w:color w:val="232C39"/>
         </w:rPr>
         <w:t xml:space="preserve"/>
       </w:r>

</xml_diff>